<commit_message>
Book 2: add Genesis 25:23 to Chapter 6; add Chapter 7 and 8 drafts
Co-Authored-By: Claude Opus 5.5 <noreply@anthropic.com>
Claude-Session: https://claude.ai/code/session_01MoWmDNVtH34VN9ywvoYJRo
</commit_message>
<xml_diff>
--- a/book2/Chapter_06_Draft.docx
+++ b/book2/Chapter_06_Draft.docx
@@ -195,7 +195,87 @@
         <w:pStyle w:val="BodyText"/>
       </w:pPr>
       <w:r>
-        <w:t xml:space="preserve">Even before they were born, the twins seemed to struggle with each other! The first was born red and hairy, and they named him</w:t>
+        <w:t xml:space="preserve">Even before they were born, the twins seemed to struggle with each other! Rebekah asked the Lord why, and God answered her:</w:t>
+      </w:r>
+    </w:p>
+    <w:p>
+      <w:pPr>
+        <w:pStyle w:val="BlockText"/>
+      </w:pPr>
+      <w:r>
+        <w:t xml:space="preserve">“</w:t>
+      </w:r>
+      <w:r>
+        <w:t xml:space="preserve">Two nations are in your womb, and two peoples from within you will be separated; one people will be stronger than the other, and the older will serve the younger.</w:t>
+      </w:r>
+      <w:r>
+        <w:t xml:space="preserve">”</w:t>
+      </w:r>
+      <w:r>
+        <w:t xml:space="preserve"> </w:t>
+      </w:r>
+      <w:r>
+        <w:t xml:space="preserve">—Genesis 25:23</w:t>
+      </w:r>
+    </w:p>
+    <w:p>
+      <w:pPr>
+        <w:pStyle w:val="FirstParagraph"/>
+      </w:pPr>
+      <w:r>
+        <w:t xml:space="preserve">Joesiah blinked.</w:t>
+      </w:r>
+      <w:r>
+        <w:t xml:space="preserve"> </w:t>
+      </w:r>
+      <w:r>
+        <w:t xml:space="preserve">“</w:t>
+      </w:r>
+      <w:r>
+        <w:t xml:space="preserve">God told her the future before the babies were even born?</w:t>
+      </w:r>
+      <w:r>
+        <w:t xml:space="preserve">”</w:t>
+      </w:r>
+    </w:p>
+    <w:p>
+      <w:pPr>
+        <w:pStyle w:val="BodyText"/>
+      </w:pPr>
+      <w:r>
+        <w:t xml:space="preserve">“</w:t>
+      </w:r>
+      <w:r>
+        <w:t xml:space="preserve">He did,</w:t>
+      </w:r>
+      <w:r>
+        <w:t xml:space="preserve">”</w:t>
+      </w:r>
+      <w:r>
+        <w:t xml:space="preserve"> </w:t>
+      </w:r>
+      <w:r>
+        <w:t xml:space="preserve">Grandma said.</w:t>
+      </w:r>
+      <w:r>
+        <w:t xml:space="preserve"> </w:t>
+      </w:r>
+      <w:r>
+        <w:t xml:space="preserve">“</w:t>
+      </w:r>
+      <w:r>
+        <w:t xml:space="preserve">Keep listening. You’ll see those words come true.</w:t>
+      </w:r>
+      <w:r>
+        <w:t xml:space="preserve">”</w:t>
+      </w:r>
+    </w:p>
+    <w:p>
+      <w:pPr>
+        <w:pStyle w:val="BodyText"/>
+      </w:pPr>
+      <w:r>
+        <w:t xml:space="preserve">When the twins were born, the first was born red and hairy, and they named him</w:t>
       </w:r>
       <w:r>
         <w:t xml:space="preserve"> </w:t>
@@ -420,7 +500,7 @@
         <w:t xml:space="preserve"> </w:t>
       </w:r>
       <w:r>
-        <w:t xml:space="preserve">about 420 words. This is the longest chapter so far. If it’s too tight on the page, the map box can be cut, since Chapter 1 already showed Haran on today’s map.</w:t>
+        <w:t xml:space="preserve">about 490 words, the longest chapter so far. At layout time it may need slightly smaller type or tighter spacing, like Book 1’s Chapter 5. You chose to keep the map box and God’s words to Rebekah.</w:t>
       </w:r>
     </w:p>
     <w:p>
@@ -513,31 +593,13 @@
           <w:bCs/>
           <w:b/>
         </w:rPr>
-        <w:t xml:space="preserve">Not included on purpose:</w:t>
-      </w:r>
-      <w:r>
-        <w:t xml:space="preserve"> </w:t>
-      </w:r>
-      <w:r>
-        <w:t xml:space="preserve">God’s words to Rebekah,</w:t>
-      </w:r>
-      <w:r>
-        <w:t xml:space="preserve"> </w:t>
-      </w:r>
-      <w:r>
-        <w:t xml:space="preserve">“</w:t>
-      </w:r>
-      <w:r>
-        <w:t xml:space="preserve">the older will serve the younger</w:t>
-      </w:r>
-      <w:r>
-        <w:t xml:space="preserve">”</w:t>
-      </w:r>
-      <w:r>
-        <w:t xml:space="preserve"> </w:t>
-      </w:r>
-      <w:r>
-        <w:t xml:space="preserve">(Genesis 25:23), to keep the page simple. Tell me if you’d like it added.</w:t>
+        <w:t xml:space="preserve">Added at your request:</w:t>
+      </w:r>
+      <w:r>
+        <w:t xml:space="preserve"> </w:t>
+      </w:r>
+      <w:r>
+        <w:t xml:space="preserve">God’s words to Rebekah (Genesis 25:23, NIV). They come true in Chapter 8, when Jacob blesses the younger grandson first.</w:t>
       </w:r>
     </w:p>
     <w:p>

</xml_diff>